<commit_message>
fix: memperbaiki halaman surat dan edit surat untuk semua role
</commit_message>
<xml_diff>
--- a/storage/templates/surat-invoice-2.docx
+++ b/storage/templates/surat-invoice-2.docx
@@ -1,6 +1,6 @@
 
 <file path=word/document.xml><?xml version="1.0" encoding="utf-8"?>
-<w:document xmlns:wpc="http://schemas.microsoft.com/office/word/2010/wordprocessingCanvas" xmlns:cx="http://schemas.microsoft.com/office/drawing/2014/chartex" xmlns:cx1="http://schemas.microsoft.com/office/drawing/2015/9/8/chartex" xmlns:cx2="http://schemas.microsoft.com/office/drawing/2015/10/21/chartex" xmlns:cx3="http://schemas.microsoft.com/office/drawing/2016/5/9/chartex" xmlns:cx4="http://schemas.microsoft.com/office/drawing/2016/5/10/chartex" xmlns:cx5="http://schemas.microsoft.com/office/drawing/2016/5/11/chartex" xmlns:cx6="http://schemas.microsoft.com/office/drawing/2016/5/12/chartex" xmlns:cx7="http://schemas.microsoft.com/office/drawing/2016/5/13/chartex" xmlns:cx8="http://schemas.microsoft.com/office/drawing/2016/5/14/chartex" xmlns:mc="http://schemas.openxmlformats.org/markup-compatibility/2006" xmlns:aink="http://schemas.microsoft.com/office/drawing/2016/ink" xmlns:am3d="http://schemas.microsoft.com/office/drawing/2017/model3d" xmlns:o="urn:schemas-microsoft-com:office:office" xmlns:oel="http://schemas.microsoft.com/office/2019/extlst" xmlns:r="http://schemas.openxmlformats.org/officeDocument/2006/relationships" xmlns:m="http://schemas.openxmlformats.org/officeDocument/2006/math" xmlns:v="urn:schemas-microsoft-com:vml" xmlns:wp14="http://schemas.microsoft.com/office/word/2010/wordprocessingDrawing" xmlns:wp="http://schemas.openxmlformats.org/drawingml/2006/wordprocessingDrawing" xmlns:w10="urn:schemas-microsoft-com:office:word" xmlns:w="http://schemas.openxmlformats.org/wordprocessingml/2006/main" xmlns:w14="http://schemas.microsoft.com/office/word/2010/wordml" xmlns:w15="http://schemas.microsoft.com/office/word/2012/wordml" xmlns:w16cex="http://schemas.microsoft.com/office/word/2018/wordml/cex" xmlns:w16cid="http://schemas.microsoft.com/office/word/2016/wordml/cid" xmlns:w16="http://schemas.microsoft.com/office/word/2018/wordml" xmlns:w16du="http://schemas.microsoft.com/office/word/2023/wordml/word16du" xmlns:w16sdtdh="http://schemas.microsoft.com/office/word/2020/wordml/sdtdatahash" xmlns:w16sdtfl="http://schemas.microsoft.com/office/word/2024/wordml/sdtformatlock" xmlns:w16se="http://schemas.microsoft.com/office/word/2015/wordml/symex" xmlns:wpg="http://schemas.microsoft.com/office/word/2010/wordprocessingGroup" xmlns:wpi="http://schemas.microsoft.com/office/word/2010/wordprocessingInk" xmlns:wne="http://schemas.microsoft.com/office/word/2006/wordml" xmlns:wps="http://schemas.microsoft.com/office/word/2010/wordprocessingShape" mc:Ignorable="w14 w15 w16se w16cid w16 w16cex w16sdtdh w16sdtfl w16du wp14">
+<w:document xmlns:wpc="http://schemas.microsoft.com/office/word/2010/wordprocessingCanvas" xmlns:cx="http://schemas.microsoft.com/office/drawing/2014/chartex" xmlns:cx1="http://schemas.microsoft.com/office/drawing/2015/9/8/chartex" xmlns:cx2="http://schemas.microsoft.com/office/drawing/2015/10/21/chartex" xmlns:cx3="http://schemas.microsoft.com/office/drawing/2016/5/9/chartex" xmlns:cx4="http://schemas.microsoft.com/office/drawing/2016/5/10/chartex" xmlns:cx5="http://schemas.microsoft.com/office/drawing/2016/5/11/chartex" xmlns:cx6="http://schemas.microsoft.com/office/drawing/2016/5/12/chartex" xmlns:cx7="http://schemas.microsoft.com/office/drawing/2016/5/13/chartex" xmlns:cx8="http://schemas.microsoft.com/office/drawing/2016/5/14/chartex" xmlns:mc="http://schemas.openxmlformats.org/markup-compatibility/2006" xmlns:aink="http://schemas.microsoft.com/office/drawing/2016/ink" xmlns:am3d="http://schemas.microsoft.com/office/drawing/2017/model3d" xmlns:o="urn:schemas-microsoft-com:office:office" xmlns:oel="http://schemas.microsoft.com/office/2019/extlst" xmlns:r="http://schemas.openxmlformats.org/officeDocument/2006/relationships" xmlns:m="http://schemas.openxmlformats.org/officeDocument/2006/math" xmlns:v="urn:schemas-microsoft-com:vml" xmlns:wp14="http://schemas.microsoft.com/office/word/2010/wordprocessingDrawing" xmlns:wp="http://schemas.openxmlformats.org/drawingml/2006/wordprocessingDrawing" xmlns:w10="urn:schemas-microsoft-com:office:word" xmlns:w="http://schemas.openxmlformats.org/wordprocessingml/2006/main" xmlns:w14="http://schemas.microsoft.com/office/word/2010/wordml" xmlns:w15="http://schemas.microsoft.com/office/word/2012/wordml" xmlns:w16cei="http://schemas.microsoft.com/office/word/2026/wordml/cei" xmlns:w16cex="http://schemas.microsoft.com/office/word/2018/wordml/cex" xmlns:w16cid="http://schemas.microsoft.com/office/word/2016/wordml/cid" xmlns:w16="http://schemas.microsoft.com/office/word/2018/wordml" xmlns:w16du="http://schemas.microsoft.com/office/word/2023/wordml/word16du" xmlns:w16sdtdh="http://schemas.microsoft.com/office/word/2020/wordml/sdtdatahash" xmlns:w16sdtfl="http://schemas.microsoft.com/office/word/2024/wordml/sdtformatlock" xmlns:w16se="http://schemas.microsoft.com/office/word/2015/wordml/symex" xmlns:wpg="http://schemas.microsoft.com/office/word/2010/wordprocessingGroup" xmlns:wpi="http://schemas.microsoft.com/office/word/2010/wordprocessingInk" xmlns:wne="http://schemas.microsoft.com/office/word/2006/wordml" xmlns:wps="http://schemas.microsoft.com/office/word/2010/wordprocessingShape" mc:Ignorable="w14 w15 w16se w16cid w16 w16cex w16sdtdh w16sdtfl w16du wp14">
   <w:background w:color="FFFFFF"/>
   <w:body>
     <w:p>
@@ -473,7 +473,7 @@
     <w:tbl>
       <w:tblPr>
         <w:tblStyle w:val="TableGrid"/>
-        <w:tblW w:w="9493" w:type="dxa"/>
+        <w:tblW w:w="9776" w:type="dxa"/>
         <w:tblInd w:w="-567" w:type="dxa"/>
         <w:tblLayout w:type="fixed"/>
         <w:tblLook w:val="04A0" w:firstRow="1" w:lastRow="0" w:firstColumn="1" w:lastColumn="0" w:noHBand="0" w:noVBand="1"/>
@@ -482,7 +482,7 @@
         <w:gridCol w:w="704"/>
         <w:gridCol w:w="3402"/>
         <w:gridCol w:w="851"/>
-        <w:gridCol w:w="2126"/>
+        <w:gridCol w:w="2409"/>
         <w:gridCol w:w="2410"/>
       </w:tblGrid>
       <w:tr>
@@ -573,7 +573,7 @@
         </w:tc>
         <w:tc>
           <w:tcPr>
-            <w:tcW w:w="2126" w:type="dxa"/>
+            <w:tcW w:w="2409" w:type="dxa"/>
             <w:tcBorders>
               <w:top w:val="single" w:sz="8" w:space="0" w:color="auto"/>
             </w:tcBorders>
@@ -681,7 +681,7 @@
         </w:tc>
         <w:tc>
           <w:tcPr>
-            <w:tcW w:w="2126" w:type="dxa"/>
+            <w:tcW w:w="2409" w:type="dxa"/>
           </w:tcPr>
           <w:p>
             <w:pPr>
@@ -746,7 +746,7 @@
         </w:tc>
         <w:tc>
           <w:tcPr>
-            <w:tcW w:w="2126" w:type="dxa"/>
+            <w:tcW w:w="2409" w:type="dxa"/>
           </w:tcPr>
           <w:p>
             <w:pPr>
@@ -801,7 +801,66 @@
         </w:tc>
         <w:tc>
           <w:tcPr>
-            <w:tcW w:w="2126" w:type="dxa"/>
+            <w:tcW w:w="2409" w:type="dxa"/>
+          </w:tcPr>
+          <w:p>
+            <w:pPr>
+              <w:pStyle w:val="BodyText"/>
+              <w:ind w:right="51"/>
+              <w:jc w:val="both"/>
+              <w:rPr>
+                <w:b/>
+                <w:bCs/>
+              </w:rPr>
+            </w:pPr>
+            <w:r>
+              <w:rPr>
+                <w:b/>
+              </w:rPr>
+              <w:t>DISC %</w:t>
+            </w:r>
+          </w:p>
+        </w:tc>
+        <w:tc>
+          <w:tcPr>
+            <w:tcW w:w="2410" w:type="dxa"/>
+          </w:tcPr>
+          <w:p>
+            <w:pPr>
+              <w:pStyle w:val="BodyText"/>
+              <w:ind w:right="51"/>
+              <w:jc w:val="both"/>
+            </w:pPr>
+            <w:r>
+              <w:t>${</w:t>
+            </w:r>
+            <w:r>
+              <w:t>diskon</w:t>
+            </w:r>
+            <w:r>
+              <w:t>}</w:t>
+            </w:r>
+          </w:p>
+        </w:tc>
+      </w:tr>
+      <w:tr>
+        <w:tc>
+          <w:tcPr>
+            <w:tcW w:w="4957" w:type="dxa"/>
+            <w:gridSpan w:val="3"/>
+            <w:vMerge/>
+          </w:tcPr>
+          <w:p>
+            <w:pPr>
+              <w:pStyle w:val="BodyText"/>
+              <w:ind w:right="51"/>
+              <w:jc w:val="both"/>
+            </w:pPr>
+          </w:p>
+        </w:tc>
+        <w:tc>
+          <w:tcPr>
+            <w:tcW w:w="2409" w:type="dxa"/>
           </w:tcPr>
           <w:p>
             <w:pPr>
@@ -855,7 +914,7 @@
         </w:tc>
         <w:tc>
           <w:tcPr>
-            <w:tcW w:w="2126" w:type="dxa"/>
+            <w:tcW w:w="2409" w:type="dxa"/>
           </w:tcPr>
           <w:p>
             <w:pPr>
@@ -909,7 +968,189 @@
         </w:tc>
         <w:tc>
           <w:tcPr>
-            <w:tcW w:w="2126" w:type="dxa"/>
+            <w:tcW w:w="2409" w:type="dxa"/>
+          </w:tcPr>
+          <w:p>
+            <w:pPr>
+              <w:pStyle w:val="BodyText"/>
+              <w:ind w:right="51"/>
+              <w:jc w:val="both"/>
+              <w:rPr>
+                <w:b/>
+                <w:bCs/>
+              </w:rPr>
+            </w:pPr>
+            <w:r>
+              <w:rPr>
+                <w:b/>
+                <w:bCs/>
+              </w:rPr>
+              <w:t xml:space="preserve">GRAND TOTAL  </w:t>
+            </w:r>
+          </w:p>
+        </w:tc>
+        <w:tc>
+          <w:tcPr>
+            <w:tcW w:w="2410" w:type="dxa"/>
+          </w:tcPr>
+          <w:p>
+            <w:pPr>
+              <w:pStyle w:val="BodyText"/>
+              <w:ind w:right="51"/>
+              <w:jc w:val="both"/>
+            </w:pPr>
+            <w:r>
+              <w:t>$</w:t>
+            </w:r>
+            <w:r>
+              <w:t>{grand_total}</w:t>
+            </w:r>
+          </w:p>
+        </w:tc>
+      </w:tr>
+      <w:tr>
+        <w:tc>
+          <w:tcPr>
+            <w:tcW w:w="4957" w:type="dxa"/>
+            <w:gridSpan w:val="3"/>
+            <w:vMerge/>
+          </w:tcPr>
+          <w:p>
+            <w:pPr>
+              <w:pStyle w:val="BodyText"/>
+              <w:ind w:right="51"/>
+              <w:jc w:val="both"/>
+            </w:pPr>
+          </w:p>
+        </w:tc>
+        <w:tc>
+          <w:tcPr>
+            <w:tcW w:w="2409" w:type="dxa"/>
+          </w:tcPr>
+          <w:p>
+            <w:pPr>
+              <w:pStyle w:val="BodyText"/>
+              <w:ind w:right="51"/>
+              <w:jc w:val="both"/>
+              <w:rPr>
+                <w:b/>
+                <w:bCs/>
+              </w:rPr>
+            </w:pPr>
+            <w:r>
+              <w:rPr>
+                <w:b/>
+                <w:bCs/>
+                <w:lang w:val="en-US"/>
+              </w:rPr>
+              <w:t xml:space="preserve">DP % </w:t>
+            </w:r>
+          </w:p>
+        </w:tc>
+        <w:tc>
+          <w:tcPr>
+            <w:tcW w:w="2410" w:type="dxa"/>
+          </w:tcPr>
+          <w:p>
+            <w:pPr>
+              <w:pStyle w:val="BodyText"/>
+              <w:ind w:right="51"/>
+              <w:jc w:val="both"/>
+            </w:pPr>
+            <w:r>
+              <w:rPr>
+                <w:lang w:val="en-US"/>
+              </w:rPr>
+              <w:t>$</w:t>
+            </w:r>
+            <w:r>
+              <w:rPr>
+                <w:lang w:val="en-US"/>
+              </w:rPr>
+              <w:t>{down_payment}</w:t>
+            </w:r>
+          </w:p>
+        </w:tc>
+      </w:tr>
+      <w:tr>
+        <w:tc>
+          <w:tcPr>
+            <w:tcW w:w="4957" w:type="dxa"/>
+            <w:gridSpan w:val="3"/>
+            <w:vMerge/>
+          </w:tcPr>
+          <w:p>
+            <w:pPr>
+              <w:pStyle w:val="BodyText"/>
+              <w:ind w:right="51"/>
+              <w:jc w:val="both"/>
+            </w:pPr>
+          </w:p>
+        </w:tc>
+        <w:tc>
+          <w:tcPr>
+            <w:tcW w:w="2409" w:type="dxa"/>
+          </w:tcPr>
+          <w:p>
+            <w:pPr>
+              <w:pStyle w:val="BodyText"/>
+              <w:ind w:right="51"/>
+              <w:jc w:val="both"/>
+              <w:rPr>
+                <w:b/>
+                <w:bCs/>
+              </w:rPr>
+            </w:pPr>
+            <w:r>
+              <w:rPr>
+                <w:b/>
+                <w:bCs/>
+                <w:lang w:val="en-US"/>
+              </w:rPr>
+              <w:t>SISA PELUNASAN</w:t>
+            </w:r>
+          </w:p>
+        </w:tc>
+        <w:tc>
+          <w:tcPr>
+            <w:tcW w:w="2410" w:type="dxa"/>
+          </w:tcPr>
+          <w:p>
+            <w:pPr>
+              <w:pStyle w:val="BodyText"/>
+              <w:ind w:right="51"/>
+              <w:jc w:val="both"/>
+            </w:pPr>
+            <w:r>
+              <w:t>${</w:t>
+            </w:r>
+            <w:r>
+              <w:t>sisa_pelunasan</w:t>
+            </w:r>
+            <w:r>
+              <w:t>}</w:t>
+            </w:r>
+          </w:p>
+        </w:tc>
+      </w:tr>
+      <w:tr>
+        <w:tc>
+          <w:tcPr>
+            <w:tcW w:w="4957" w:type="dxa"/>
+            <w:gridSpan w:val="3"/>
+            <w:vMerge/>
+          </w:tcPr>
+          <w:p>
+            <w:pPr>
+              <w:pStyle w:val="BodyText"/>
+              <w:ind w:right="51"/>
+              <w:jc w:val="both"/>
+            </w:pPr>
+          </w:p>
+        </w:tc>
+        <w:tc>
+          <w:tcPr>
+            <w:tcW w:w="2409" w:type="dxa"/>
           </w:tcPr>
           <w:p>
             <w:pPr>
@@ -1906,7 +2147,7 @@
 </file>
 
 <file path=word/endnotes.xml><?xml version="1.0" encoding="utf-8"?>
-<w:endnotes xmlns:wpc="http://schemas.microsoft.com/office/word/2010/wordprocessingCanvas" xmlns:cx="http://schemas.microsoft.com/office/drawing/2014/chartex" xmlns:cx1="http://schemas.microsoft.com/office/drawing/2015/9/8/chartex" xmlns:cx2="http://schemas.microsoft.com/office/drawing/2015/10/21/chartex" xmlns:cx3="http://schemas.microsoft.com/office/drawing/2016/5/9/chartex" xmlns:cx4="http://schemas.microsoft.com/office/drawing/2016/5/10/chartex" xmlns:cx5="http://schemas.microsoft.com/office/drawing/2016/5/11/chartex" xmlns:cx6="http://schemas.microsoft.com/office/drawing/2016/5/12/chartex" xmlns:cx7="http://schemas.microsoft.com/office/drawing/2016/5/13/chartex" xmlns:cx8="http://schemas.microsoft.com/office/drawing/2016/5/14/chartex" xmlns:mc="http://schemas.openxmlformats.org/markup-compatibility/2006" xmlns:aink="http://schemas.microsoft.com/office/drawing/2016/ink" xmlns:am3d="http://schemas.microsoft.com/office/drawing/2017/model3d" xmlns:o="urn:schemas-microsoft-com:office:office" xmlns:oel="http://schemas.microsoft.com/office/2019/extlst" xmlns:r="http://schemas.openxmlformats.org/officeDocument/2006/relationships" xmlns:m="http://schemas.openxmlformats.org/officeDocument/2006/math" xmlns:v="urn:schemas-microsoft-com:vml" xmlns:wp14="http://schemas.microsoft.com/office/word/2010/wordprocessingDrawing" xmlns:wp="http://schemas.openxmlformats.org/drawingml/2006/wordprocessingDrawing" xmlns:w10="urn:schemas-microsoft-com:office:word" xmlns:w="http://schemas.openxmlformats.org/wordprocessingml/2006/main" xmlns:w14="http://schemas.microsoft.com/office/word/2010/wordml" xmlns:w15="http://schemas.microsoft.com/office/word/2012/wordml" xmlns:w16cex="http://schemas.microsoft.com/office/word/2018/wordml/cex" xmlns:w16cid="http://schemas.microsoft.com/office/word/2016/wordml/cid" xmlns:w16="http://schemas.microsoft.com/office/word/2018/wordml" xmlns:w16du="http://schemas.microsoft.com/office/word/2023/wordml/word16du" xmlns:w16sdtdh="http://schemas.microsoft.com/office/word/2020/wordml/sdtdatahash" xmlns:w16sdtfl="http://schemas.microsoft.com/office/word/2024/wordml/sdtformatlock" xmlns:w16se="http://schemas.microsoft.com/office/word/2015/wordml/symex" xmlns:wpg="http://schemas.microsoft.com/office/word/2010/wordprocessingGroup" xmlns:wpi="http://schemas.microsoft.com/office/word/2010/wordprocessingInk" xmlns:wne="http://schemas.microsoft.com/office/word/2006/wordml" xmlns:wps="http://schemas.microsoft.com/office/word/2010/wordprocessingShape" mc:Ignorable="w14 w15 w16se w16cid w16 w16cex w16sdtdh w16sdtfl w16du wp14">
+<w:endnotes xmlns:wpc="http://schemas.microsoft.com/office/word/2010/wordprocessingCanvas" xmlns:cx="http://schemas.microsoft.com/office/drawing/2014/chartex" xmlns:cx1="http://schemas.microsoft.com/office/drawing/2015/9/8/chartex" xmlns:cx2="http://schemas.microsoft.com/office/drawing/2015/10/21/chartex" xmlns:cx3="http://schemas.microsoft.com/office/drawing/2016/5/9/chartex" xmlns:cx4="http://schemas.microsoft.com/office/drawing/2016/5/10/chartex" xmlns:cx5="http://schemas.microsoft.com/office/drawing/2016/5/11/chartex" xmlns:cx6="http://schemas.microsoft.com/office/drawing/2016/5/12/chartex" xmlns:cx7="http://schemas.microsoft.com/office/drawing/2016/5/13/chartex" xmlns:cx8="http://schemas.microsoft.com/office/drawing/2016/5/14/chartex" xmlns:mc="http://schemas.openxmlformats.org/markup-compatibility/2006" xmlns:aink="http://schemas.microsoft.com/office/drawing/2016/ink" xmlns:am3d="http://schemas.microsoft.com/office/drawing/2017/model3d" xmlns:o="urn:schemas-microsoft-com:office:office" xmlns:oel="http://schemas.microsoft.com/office/2019/extlst" xmlns:r="http://schemas.openxmlformats.org/officeDocument/2006/relationships" xmlns:m="http://schemas.openxmlformats.org/officeDocument/2006/math" xmlns:v="urn:schemas-microsoft-com:vml" xmlns:wp14="http://schemas.microsoft.com/office/word/2010/wordprocessingDrawing" xmlns:wp="http://schemas.openxmlformats.org/drawingml/2006/wordprocessingDrawing" xmlns:w10="urn:schemas-microsoft-com:office:word" xmlns:w="http://schemas.openxmlformats.org/wordprocessingml/2006/main" xmlns:w14="http://schemas.microsoft.com/office/word/2010/wordml" xmlns:w15="http://schemas.microsoft.com/office/word/2012/wordml" xmlns:w16cei="http://schemas.microsoft.com/office/word/2026/wordml/cei" xmlns:w16cex="http://schemas.microsoft.com/office/word/2018/wordml/cex" xmlns:w16cid="http://schemas.microsoft.com/office/word/2016/wordml/cid" xmlns:w16="http://schemas.microsoft.com/office/word/2018/wordml" xmlns:w16du="http://schemas.microsoft.com/office/word/2023/wordml/word16du" xmlns:w16sdtdh="http://schemas.microsoft.com/office/word/2020/wordml/sdtdatahash" xmlns:w16sdtfl="http://schemas.microsoft.com/office/word/2024/wordml/sdtformatlock" xmlns:w16se="http://schemas.microsoft.com/office/word/2015/wordml/symex" xmlns:wpg="http://schemas.microsoft.com/office/word/2010/wordprocessingGroup" xmlns:wpi="http://schemas.microsoft.com/office/word/2010/wordprocessingInk" xmlns:wne="http://schemas.microsoft.com/office/word/2006/wordml" xmlns:wps="http://schemas.microsoft.com/office/word/2010/wordprocessingShape" mc:Ignorable="w14 w15 w16se w16cid w16 w16cex w16sdtdh w16sdtfl w16du wp14">
   <w:endnote w:type="separator" w:id="-1">
     <w:p>
       <w:pPr>
@@ -1931,7 +2172,7 @@
 </file>
 
 <file path=word/footnotes.xml><?xml version="1.0" encoding="utf-8"?>
-<w:footnotes xmlns:wpc="http://schemas.microsoft.com/office/word/2010/wordprocessingCanvas" xmlns:cx="http://schemas.microsoft.com/office/drawing/2014/chartex" xmlns:cx1="http://schemas.microsoft.com/office/drawing/2015/9/8/chartex" xmlns:cx2="http://schemas.microsoft.com/office/drawing/2015/10/21/chartex" xmlns:cx3="http://schemas.microsoft.com/office/drawing/2016/5/9/chartex" xmlns:cx4="http://schemas.microsoft.com/office/drawing/2016/5/10/chartex" xmlns:cx5="http://schemas.microsoft.com/office/drawing/2016/5/11/chartex" xmlns:cx6="http://schemas.microsoft.com/office/drawing/2016/5/12/chartex" xmlns:cx7="http://schemas.microsoft.com/office/drawing/2016/5/13/chartex" xmlns:cx8="http://schemas.microsoft.com/office/drawing/2016/5/14/chartex" xmlns:mc="http://schemas.openxmlformats.org/markup-compatibility/2006" xmlns:aink="http://schemas.microsoft.com/office/drawing/2016/ink" xmlns:am3d="http://schemas.microsoft.com/office/drawing/2017/model3d" xmlns:o="urn:schemas-microsoft-com:office:office" xmlns:oel="http://schemas.microsoft.com/office/2019/extlst" xmlns:r="http://schemas.openxmlformats.org/officeDocument/2006/relationships" xmlns:m="http://schemas.openxmlformats.org/officeDocument/2006/math" xmlns:v="urn:schemas-microsoft-com:vml" xmlns:wp14="http://schemas.microsoft.com/office/word/2010/wordprocessingDrawing" xmlns:wp="http://schemas.openxmlformats.org/drawingml/2006/wordprocessingDrawing" xmlns:w10="urn:schemas-microsoft-com:office:word" xmlns:w="http://schemas.openxmlformats.org/wordprocessingml/2006/main" xmlns:w14="http://schemas.microsoft.com/office/word/2010/wordml" xmlns:w15="http://schemas.microsoft.com/office/word/2012/wordml" xmlns:w16cex="http://schemas.microsoft.com/office/word/2018/wordml/cex" xmlns:w16cid="http://schemas.microsoft.com/office/word/2016/wordml/cid" xmlns:w16="http://schemas.microsoft.com/office/word/2018/wordml" xmlns:w16du="http://schemas.microsoft.com/office/word/2023/wordml/word16du" xmlns:w16sdtdh="http://schemas.microsoft.com/office/word/2020/wordml/sdtdatahash" xmlns:w16sdtfl="http://schemas.microsoft.com/office/word/2024/wordml/sdtformatlock" xmlns:w16se="http://schemas.microsoft.com/office/word/2015/wordml/symex" xmlns:wpg="http://schemas.microsoft.com/office/word/2010/wordprocessingGroup" xmlns:wpi="http://schemas.microsoft.com/office/word/2010/wordprocessingInk" xmlns:wne="http://schemas.microsoft.com/office/word/2006/wordml" xmlns:wps="http://schemas.microsoft.com/office/word/2010/wordprocessingShape" mc:Ignorable="w14 w15 w16se w16cid w16 w16cex w16sdtdh w16sdtfl w16du wp14">
+<w:footnotes xmlns:wpc="http://schemas.microsoft.com/office/word/2010/wordprocessingCanvas" xmlns:cx="http://schemas.microsoft.com/office/drawing/2014/chartex" xmlns:cx1="http://schemas.microsoft.com/office/drawing/2015/9/8/chartex" xmlns:cx2="http://schemas.microsoft.com/office/drawing/2015/10/21/chartex" xmlns:cx3="http://schemas.microsoft.com/office/drawing/2016/5/9/chartex" xmlns:cx4="http://schemas.microsoft.com/office/drawing/2016/5/10/chartex" xmlns:cx5="http://schemas.microsoft.com/office/drawing/2016/5/11/chartex" xmlns:cx6="http://schemas.microsoft.com/office/drawing/2016/5/12/chartex" xmlns:cx7="http://schemas.microsoft.com/office/drawing/2016/5/13/chartex" xmlns:cx8="http://schemas.microsoft.com/office/drawing/2016/5/14/chartex" xmlns:mc="http://schemas.openxmlformats.org/markup-compatibility/2006" xmlns:aink="http://schemas.microsoft.com/office/drawing/2016/ink" xmlns:am3d="http://schemas.microsoft.com/office/drawing/2017/model3d" xmlns:o="urn:schemas-microsoft-com:office:office" xmlns:oel="http://schemas.microsoft.com/office/2019/extlst" xmlns:r="http://schemas.openxmlformats.org/officeDocument/2006/relationships" xmlns:m="http://schemas.openxmlformats.org/officeDocument/2006/math" xmlns:v="urn:schemas-microsoft-com:vml" xmlns:wp14="http://schemas.microsoft.com/office/word/2010/wordprocessingDrawing" xmlns:wp="http://schemas.openxmlformats.org/drawingml/2006/wordprocessingDrawing" xmlns:w10="urn:schemas-microsoft-com:office:word" xmlns:w="http://schemas.openxmlformats.org/wordprocessingml/2006/main" xmlns:w14="http://schemas.microsoft.com/office/word/2010/wordml" xmlns:w15="http://schemas.microsoft.com/office/word/2012/wordml" xmlns:w16cei="http://schemas.microsoft.com/office/word/2026/wordml/cei" xmlns:w16cex="http://schemas.microsoft.com/office/word/2018/wordml/cex" xmlns:w16cid="http://schemas.microsoft.com/office/word/2016/wordml/cid" xmlns:w16="http://schemas.microsoft.com/office/word/2018/wordml" xmlns:w16du="http://schemas.microsoft.com/office/word/2023/wordml/word16du" xmlns:w16sdtdh="http://schemas.microsoft.com/office/word/2020/wordml/sdtdatahash" xmlns:w16sdtfl="http://schemas.microsoft.com/office/word/2024/wordml/sdtformatlock" xmlns:w16se="http://schemas.microsoft.com/office/word/2015/wordml/symex" xmlns:wpg="http://schemas.microsoft.com/office/word/2010/wordprocessingGroup" xmlns:wpi="http://schemas.microsoft.com/office/word/2010/wordprocessingInk" xmlns:wne="http://schemas.microsoft.com/office/word/2006/wordml" xmlns:wps="http://schemas.microsoft.com/office/word/2010/wordprocessingShape" mc:Ignorable="w14 w15 w16se w16cid w16 w16cex w16sdtdh w16sdtfl w16du wp14">
   <w:footnote w:type="separator" w:id="-1">
     <w:p>
       <w:pPr>
@@ -1956,7 +2197,7 @@
 </file>
 
 <file path=word/header1.xml><?xml version="1.0" encoding="utf-8"?>
-<w:hdr xmlns:wpc="http://schemas.microsoft.com/office/word/2010/wordprocessingCanvas" xmlns:cx="http://schemas.microsoft.com/office/drawing/2014/chartex" xmlns:cx1="http://schemas.microsoft.com/office/drawing/2015/9/8/chartex" xmlns:cx2="http://schemas.microsoft.com/office/drawing/2015/10/21/chartex" xmlns:cx3="http://schemas.microsoft.com/office/drawing/2016/5/9/chartex" xmlns:cx4="http://schemas.microsoft.com/office/drawing/2016/5/10/chartex" xmlns:cx5="http://schemas.microsoft.com/office/drawing/2016/5/11/chartex" xmlns:cx6="http://schemas.microsoft.com/office/drawing/2016/5/12/chartex" xmlns:cx7="http://schemas.microsoft.com/office/drawing/2016/5/13/chartex" xmlns:cx8="http://schemas.microsoft.com/office/drawing/2016/5/14/chartex" xmlns:mc="http://schemas.openxmlformats.org/markup-compatibility/2006" xmlns:aink="http://schemas.microsoft.com/office/drawing/2016/ink" xmlns:am3d="http://schemas.microsoft.com/office/drawing/2017/model3d" xmlns:o="urn:schemas-microsoft-com:office:office" xmlns:oel="http://schemas.microsoft.com/office/2019/extlst" xmlns:r="http://schemas.openxmlformats.org/officeDocument/2006/relationships" xmlns:m="http://schemas.openxmlformats.org/officeDocument/2006/math" xmlns:v="urn:schemas-microsoft-com:vml" xmlns:wp14="http://schemas.microsoft.com/office/word/2010/wordprocessingDrawing" xmlns:wp="http://schemas.openxmlformats.org/drawingml/2006/wordprocessingDrawing" xmlns:w10="urn:schemas-microsoft-com:office:word" xmlns:w="http://schemas.openxmlformats.org/wordprocessingml/2006/main" xmlns:w14="http://schemas.microsoft.com/office/word/2010/wordml" xmlns:w15="http://schemas.microsoft.com/office/word/2012/wordml" xmlns:w16cex="http://schemas.microsoft.com/office/word/2018/wordml/cex" xmlns:w16cid="http://schemas.microsoft.com/office/word/2016/wordml/cid" xmlns:w16="http://schemas.microsoft.com/office/word/2018/wordml" xmlns:w16du="http://schemas.microsoft.com/office/word/2023/wordml/word16du" xmlns:w16sdtdh="http://schemas.microsoft.com/office/word/2020/wordml/sdtdatahash" xmlns:w16sdtfl="http://schemas.microsoft.com/office/word/2024/wordml/sdtformatlock" xmlns:w16se="http://schemas.microsoft.com/office/word/2015/wordml/symex" xmlns:wpg="http://schemas.microsoft.com/office/word/2010/wordprocessingGroup" xmlns:wpi="http://schemas.microsoft.com/office/word/2010/wordprocessingInk" xmlns:wne="http://schemas.microsoft.com/office/word/2006/wordml" xmlns:wps="http://schemas.microsoft.com/office/word/2010/wordprocessingShape" mc:Ignorable="w14 w15 w16se w16cid w16 w16cex w16sdtdh w16sdtfl w16du wp14">
+<w:hdr xmlns:wpc="http://schemas.microsoft.com/office/word/2010/wordprocessingCanvas" xmlns:cx="http://schemas.microsoft.com/office/drawing/2014/chartex" xmlns:cx1="http://schemas.microsoft.com/office/drawing/2015/9/8/chartex" xmlns:cx2="http://schemas.microsoft.com/office/drawing/2015/10/21/chartex" xmlns:cx3="http://schemas.microsoft.com/office/drawing/2016/5/9/chartex" xmlns:cx4="http://schemas.microsoft.com/office/drawing/2016/5/10/chartex" xmlns:cx5="http://schemas.microsoft.com/office/drawing/2016/5/11/chartex" xmlns:cx6="http://schemas.microsoft.com/office/drawing/2016/5/12/chartex" xmlns:cx7="http://schemas.microsoft.com/office/drawing/2016/5/13/chartex" xmlns:cx8="http://schemas.microsoft.com/office/drawing/2016/5/14/chartex" xmlns:mc="http://schemas.openxmlformats.org/markup-compatibility/2006" xmlns:aink="http://schemas.microsoft.com/office/drawing/2016/ink" xmlns:am3d="http://schemas.microsoft.com/office/drawing/2017/model3d" xmlns:o="urn:schemas-microsoft-com:office:office" xmlns:oel="http://schemas.microsoft.com/office/2019/extlst" xmlns:r="http://schemas.openxmlformats.org/officeDocument/2006/relationships" xmlns:m="http://schemas.openxmlformats.org/officeDocument/2006/math" xmlns:v="urn:schemas-microsoft-com:vml" xmlns:wp14="http://schemas.microsoft.com/office/word/2010/wordprocessingDrawing" xmlns:wp="http://schemas.openxmlformats.org/drawingml/2006/wordprocessingDrawing" xmlns:w10="urn:schemas-microsoft-com:office:word" xmlns:w="http://schemas.openxmlformats.org/wordprocessingml/2006/main" xmlns:w14="http://schemas.microsoft.com/office/word/2010/wordml" xmlns:w15="http://schemas.microsoft.com/office/word/2012/wordml" xmlns:w16cei="http://schemas.microsoft.com/office/word/2026/wordml/cei" xmlns:w16cex="http://schemas.microsoft.com/office/word/2018/wordml/cex" xmlns:w16cid="http://schemas.microsoft.com/office/word/2016/wordml/cid" xmlns:w16="http://schemas.microsoft.com/office/word/2018/wordml" xmlns:w16du="http://schemas.microsoft.com/office/word/2023/wordml/word16du" xmlns:w16sdtdh="http://schemas.microsoft.com/office/word/2020/wordml/sdtdatahash" xmlns:w16sdtfl="http://schemas.microsoft.com/office/word/2024/wordml/sdtformatlock" xmlns:w16se="http://schemas.microsoft.com/office/word/2015/wordml/symex" xmlns:wpg="http://schemas.microsoft.com/office/word/2010/wordprocessingGroup" xmlns:wpi="http://schemas.microsoft.com/office/word/2010/wordprocessingInk" xmlns:wne="http://schemas.microsoft.com/office/word/2006/wordml" xmlns:wps="http://schemas.microsoft.com/office/word/2010/wordprocessingShape" mc:Ignorable="w14 w15 w16se w16cid w16 w16cex w16sdtdh w16sdtfl w16du wp14">
   <w:p>
     <w:pPr>
       <w:pStyle w:val="Header"/>
@@ -2330,7 +2571,7 @@
 </file>
 
 <file path=word/header2.xml><?xml version="1.0" encoding="utf-8"?>
-<w:hdr xmlns:wpc="http://schemas.microsoft.com/office/word/2010/wordprocessingCanvas" xmlns:cx="http://schemas.microsoft.com/office/drawing/2014/chartex" xmlns:cx1="http://schemas.microsoft.com/office/drawing/2015/9/8/chartex" xmlns:cx2="http://schemas.microsoft.com/office/drawing/2015/10/21/chartex" xmlns:cx3="http://schemas.microsoft.com/office/drawing/2016/5/9/chartex" xmlns:cx4="http://schemas.microsoft.com/office/drawing/2016/5/10/chartex" xmlns:cx5="http://schemas.microsoft.com/office/drawing/2016/5/11/chartex" xmlns:cx6="http://schemas.microsoft.com/office/drawing/2016/5/12/chartex" xmlns:cx7="http://schemas.microsoft.com/office/drawing/2016/5/13/chartex" xmlns:cx8="http://schemas.microsoft.com/office/drawing/2016/5/14/chartex" xmlns:mc="http://schemas.openxmlformats.org/markup-compatibility/2006" xmlns:aink="http://schemas.microsoft.com/office/drawing/2016/ink" xmlns:am3d="http://schemas.microsoft.com/office/drawing/2017/model3d" xmlns:o="urn:schemas-microsoft-com:office:office" xmlns:oel="http://schemas.microsoft.com/office/2019/extlst" xmlns:r="http://schemas.openxmlformats.org/officeDocument/2006/relationships" xmlns:m="http://schemas.openxmlformats.org/officeDocument/2006/math" xmlns:v="urn:schemas-microsoft-com:vml" xmlns:wp14="http://schemas.microsoft.com/office/word/2010/wordprocessingDrawing" xmlns:wp="http://schemas.openxmlformats.org/drawingml/2006/wordprocessingDrawing" xmlns:w10="urn:schemas-microsoft-com:office:word" xmlns:w="http://schemas.openxmlformats.org/wordprocessingml/2006/main" xmlns:w14="http://schemas.microsoft.com/office/word/2010/wordml" xmlns:w15="http://schemas.microsoft.com/office/word/2012/wordml" xmlns:w16cex="http://schemas.microsoft.com/office/word/2018/wordml/cex" xmlns:w16cid="http://schemas.microsoft.com/office/word/2016/wordml/cid" xmlns:w16="http://schemas.microsoft.com/office/word/2018/wordml" xmlns:w16du="http://schemas.microsoft.com/office/word/2023/wordml/word16du" xmlns:w16sdtdh="http://schemas.microsoft.com/office/word/2020/wordml/sdtdatahash" xmlns:w16sdtfl="http://schemas.microsoft.com/office/word/2024/wordml/sdtformatlock" xmlns:w16se="http://schemas.microsoft.com/office/word/2015/wordml/symex" xmlns:wpg="http://schemas.microsoft.com/office/word/2010/wordprocessingGroup" xmlns:wpi="http://schemas.microsoft.com/office/word/2010/wordprocessingInk" xmlns:wne="http://schemas.microsoft.com/office/word/2006/wordml" xmlns:wps="http://schemas.microsoft.com/office/word/2010/wordprocessingShape" mc:Ignorable="w14 w15 w16se w16cid w16 w16cex w16sdtdh w16sdtfl w16du wp14">
+<w:hdr xmlns:wpc="http://schemas.microsoft.com/office/word/2010/wordprocessingCanvas" xmlns:cx="http://schemas.microsoft.com/office/drawing/2014/chartex" xmlns:cx1="http://schemas.microsoft.com/office/drawing/2015/9/8/chartex" xmlns:cx2="http://schemas.microsoft.com/office/drawing/2015/10/21/chartex" xmlns:cx3="http://schemas.microsoft.com/office/drawing/2016/5/9/chartex" xmlns:cx4="http://schemas.microsoft.com/office/drawing/2016/5/10/chartex" xmlns:cx5="http://schemas.microsoft.com/office/drawing/2016/5/11/chartex" xmlns:cx6="http://schemas.microsoft.com/office/drawing/2016/5/12/chartex" xmlns:cx7="http://schemas.microsoft.com/office/drawing/2016/5/13/chartex" xmlns:cx8="http://schemas.microsoft.com/office/drawing/2016/5/14/chartex" xmlns:mc="http://schemas.openxmlformats.org/markup-compatibility/2006" xmlns:aink="http://schemas.microsoft.com/office/drawing/2016/ink" xmlns:am3d="http://schemas.microsoft.com/office/drawing/2017/model3d" xmlns:o="urn:schemas-microsoft-com:office:office" xmlns:oel="http://schemas.microsoft.com/office/2019/extlst" xmlns:r="http://schemas.openxmlformats.org/officeDocument/2006/relationships" xmlns:m="http://schemas.openxmlformats.org/officeDocument/2006/math" xmlns:v="urn:schemas-microsoft-com:vml" xmlns:wp14="http://schemas.microsoft.com/office/word/2010/wordprocessingDrawing" xmlns:wp="http://schemas.openxmlformats.org/drawingml/2006/wordprocessingDrawing" xmlns:w10="urn:schemas-microsoft-com:office:word" xmlns:w="http://schemas.openxmlformats.org/wordprocessingml/2006/main" xmlns:w14="http://schemas.microsoft.com/office/word/2010/wordml" xmlns:w15="http://schemas.microsoft.com/office/word/2012/wordml" xmlns:w16cei="http://schemas.microsoft.com/office/word/2026/wordml/cei" xmlns:w16cex="http://schemas.microsoft.com/office/word/2018/wordml/cex" xmlns:w16cid="http://schemas.microsoft.com/office/word/2016/wordml/cid" xmlns:w16="http://schemas.microsoft.com/office/word/2018/wordml" xmlns:w16du="http://schemas.microsoft.com/office/word/2023/wordml/word16du" xmlns:w16sdtdh="http://schemas.microsoft.com/office/word/2020/wordml/sdtdatahash" xmlns:w16sdtfl="http://schemas.microsoft.com/office/word/2024/wordml/sdtformatlock" xmlns:w16se="http://schemas.microsoft.com/office/word/2015/wordml/symex" xmlns:wpg="http://schemas.microsoft.com/office/word/2010/wordprocessingGroup" xmlns:wpi="http://schemas.microsoft.com/office/word/2010/wordprocessingInk" xmlns:wne="http://schemas.microsoft.com/office/word/2006/wordml" xmlns:wps="http://schemas.microsoft.com/office/word/2010/wordprocessingShape" mc:Ignorable="w14 w15 w16se w16cid w16 w16cex w16sdtdh w16sdtfl w16du wp14">
   <w:p>
     <w:r>
       <w:pict w14:anchorId="0DBBE080">
@@ -2364,7 +2605,7 @@
 </file>
 
 <file path=word/numbering.xml><?xml version="1.0" encoding="utf-8"?>
-<w:numbering xmlns:wpc="http://schemas.microsoft.com/office/word/2010/wordprocessingCanvas" xmlns:cx="http://schemas.microsoft.com/office/drawing/2014/chartex" xmlns:cx1="http://schemas.microsoft.com/office/drawing/2015/9/8/chartex" xmlns:cx2="http://schemas.microsoft.com/office/drawing/2015/10/21/chartex" xmlns:cx3="http://schemas.microsoft.com/office/drawing/2016/5/9/chartex" xmlns:cx4="http://schemas.microsoft.com/office/drawing/2016/5/10/chartex" xmlns:cx5="http://schemas.microsoft.com/office/drawing/2016/5/11/chartex" xmlns:cx6="http://schemas.microsoft.com/office/drawing/2016/5/12/chartex" xmlns:cx7="http://schemas.microsoft.com/office/drawing/2016/5/13/chartex" xmlns:cx8="http://schemas.microsoft.com/office/drawing/2016/5/14/chartex" xmlns:mc="http://schemas.openxmlformats.org/markup-compatibility/2006" xmlns:aink="http://schemas.microsoft.com/office/drawing/2016/ink" xmlns:am3d="http://schemas.microsoft.com/office/drawing/2017/model3d" xmlns:o="urn:schemas-microsoft-com:office:office" xmlns:oel="http://schemas.microsoft.com/office/2019/extlst" xmlns:r="http://schemas.openxmlformats.org/officeDocument/2006/relationships" xmlns:m="http://schemas.openxmlformats.org/officeDocument/2006/math" xmlns:v="urn:schemas-microsoft-com:vml" xmlns:wp14="http://schemas.microsoft.com/office/word/2010/wordprocessingDrawing" xmlns:wp="http://schemas.openxmlformats.org/drawingml/2006/wordprocessingDrawing" xmlns:w10="urn:schemas-microsoft-com:office:word" xmlns:w="http://schemas.openxmlformats.org/wordprocessingml/2006/main" xmlns:w14="http://schemas.microsoft.com/office/word/2010/wordml" xmlns:w15="http://schemas.microsoft.com/office/word/2012/wordml" xmlns:w16cex="http://schemas.microsoft.com/office/word/2018/wordml/cex" xmlns:w16cid="http://schemas.microsoft.com/office/word/2016/wordml/cid" xmlns:w16="http://schemas.microsoft.com/office/word/2018/wordml" xmlns:w16du="http://schemas.microsoft.com/office/word/2023/wordml/word16du" xmlns:w16sdtdh="http://schemas.microsoft.com/office/word/2020/wordml/sdtdatahash" xmlns:w16sdtfl="http://schemas.microsoft.com/office/word/2024/wordml/sdtformatlock" xmlns:w16se="http://schemas.microsoft.com/office/word/2015/wordml/symex" xmlns:wpg="http://schemas.microsoft.com/office/word/2010/wordprocessingGroup" xmlns:wpi="http://schemas.microsoft.com/office/word/2010/wordprocessingInk" xmlns:wne="http://schemas.microsoft.com/office/word/2006/wordml" xmlns:wps="http://schemas.microsoft.com/office/word/2010/wordprocessingShape" mc:Ignorable="w14 w15 w16se w16cid w16 w16cex w16sdtdh w16sdtfl w16du wp14">
+<w:numbering xmlns:wpc="http://schemas.microsoft.com/office/word/2010/wordprocessingCanvas" xmlns:cx="http://schemas.microsoft.com/office/drawing/2014/chartex" xmlns:cx1="http://schemas.microsoft.com/office/drawing/2015/9/8/chartex" xmlns:cx2="http://schemas.microsoft.com/office/drawing/2015/10/21/chartex" xmlns:cx3="http://schemas.microsoft.com/office/drawing/2016/5/9/chartex" xmlns:cx4="http://schemas.microsoft.com/office/drawing/2016/5/10/chartex" xmlns:cx5="http://schemas.microsoft.com/office/drawing/2016/5/11/chartex" xmlns:cx6="http://schemas.microsoft.com/office/drawing/2016/5/12/chartex" xmlns:cx7="http://schemas.microsoft.com/office/drawing/2016/5/13/chartex" xmlns:cx8="http://schemas.microsoft.com/office/drawing/2016/5/14/chartex" xmlns:mc="http://schemas.openxmlformats.org/markup-compatibility/2006" xmlns:aink="http://schemas.microsoft.com/office/drawing/2016/ink" xmlns:am3d="http://schemas.microsoft.com/office/drawing/2017/model3d" xmlns:o="urn:schemas-microsoft-com:office:office" xmlns:oel="http://schemas.microsoft.com/office/2019/extlst" xmlns:r="http://schemas.openxmlformats.org/officeDocument/2006/relationships" xmlns:m="http://schemas.openxmlformats.org/officeDocument/2006/math" xmlns:v="urn:schemas-microsoft-com:vml" xmlns:wp14="http://schemas.microsoft.com/office/word/2010/wordprocessingDrawing" xmlns:wp="http://schemas.openxmlformats.org/drawingml/2006/wordprocessingDrawing" xmlns:w10="urn:schemas-microsoft-com:office:word" xmlns:w="http://schemas.openxmlformats.org/wordprocessingml/2006/main" xmlns:w14="http://schemas.microsoft.com/office/word/2010/wordml" xmlns:w15="http://schemas.microsoft.com/office/word/2012/wordml" xmlns:w16cei="http://schemas.microsoft.com/office/word/2026/wordml/cei" xmlns:w16cex="http://schemas.microsoft.com/office/word/2018/wordml/cex" xmlns:w16cid="http://schemas.microsoft.com/office/word/2016/wordml/cid" xmlns:w16="http://schemas.microsoft.com/office/word/2018/wordml" xmlns:w16du="http://schemas.microsoft.com/office/word/2023/wordml/word16du" xmlns:w16sdtdh="http://schemas.microsoft.com/office/word/2020/wordml/sdtdatahash" xmlns:w16sdtfl="http://schemas.microsoft.com/office/word/2024/wordml/sdtformatlock" xmlns:w16se="http://schemas.microsoft.com/office/word/2015/wordml/symex" xmlns:wpg="http://schemas.microsoft.com/office/word/2010/wordprocessingGroup" xmlns:wpi="http://schemas.microsoft.com/office/word/2010/wordprocessingInk" xmlns:wne="http://schemas.microsoft.com/office/word/2006/wordml" xmlns:wps="http://schemas.microsoft.com/office/word/2010/wordprocessingShape" mc:Ignorable="w14 w15 w16se w16cid w16 w16cex w16sdtdh w16sdtfl w16du wp14">
   <w:abstractNum w:abstractNumId="0" w15:restartNumberingAfterBreak="0">
     <w:nsid w:val="0DD43B8D"/>
     <w:multiLevelType w:val="hybridMultilevel"/>

</xml_diff>

<commit_message>
fix: default tanggal ke hari ini pada form Buat/Edit Surat pada Halaman Surat dan Edit Surat  semua Role
</commit_message>
<xml_diff>
--- a/storage/templates/surat-invoice-2.docx
+++ b/storage/templates/surat-invoice-2.docx
@@ -1,6 +1,6 @@
 
 <file path=word/document.xml><?xml version="1.0" encoding="utf-8"?>
-<w:document xmlns:wpc="http://schemas.microsoft.com/office/word/2010/wordprocessingCanvas" xmlns:cx="http://schemas.microsoft.com/office/drawing/2014/chartex" xmlns:cx1="http://schemas.microsoft.com/office/drawing/2015/9/8/chartex" xmlns:cx2="http://schemas.microsoft.com/office/drawing/2015/10/21/chartex" xmlns:cx3="http://schemas.microsoft.com/office/drawing/2016/5/9/chartex" xmlns:cx4="http://schemas.microsoft.com/office/drawing/2016/5/10/chartex" xmlns:cx5="http://schemas.microsoft.com/office/drawing/2016/5/11/chartex" xmlns:cx6="http://schemas.microsoft.com/office/drawing/2016/5/12/chartex" xmlns:cx7="http://schemas.microsoft.com/office/drawing/2016/5/13/chartex" xmlns:cx8="http://schemas.microsoft.com/office/drawing/2016/5/14/chartex" xmlns:mc="http://schemas.openxmlformats.org/markup-compatibility/2006" xmlns:aink="http://schemas.microsoft.com/office/drawing/2016/ink" xmlns:am3d="http://schemas.microsoft.com/office/drawing/2017/model3d" xmlns:o="urn:schemas-microsoft-com:office:office" xmlns:oel="http://schemas.microsoft.com/office/2019/extlst" xmlns:r="http://schemas.openxmlformats.org/officeDocument/2006/relationships" xmlns:m="http://schemas.openxmlformats.org/officeDocument/2006/math" xmlns:v="urn:schemas-microsoft-com:vml" xmlns:wp14="http://schemas.microsoft.com/office/word/2010/wordprocessingDrawing" xmlns:wp="http://schemas.openxmlformats.org/drawingml/2006/wordprocessingDrawing" xmlns:w10="urn:schemas-microsoft-com:office:word" xmlns:w="http://schemas.openxmlformats.org/wordprocessingml/2006/main" xmlns:w14="http://schemas.microsoft.com/office/word/2010/wordml" xmlns:w15="http://schemas.microsoft.com/office/word/2012/wordml" xmlns:w16cei="http://schemas.microsoft.com/office/word/2026/wordml/cei" xmlns:w16cex="http://schemas.microsoft.com/office/word/2018/wordml/cex" xmlns:w16cid="http://schemas.microsoft.com/office/word/2016/wordml/cid" xmlns:w16="http://schemas.microsoft.com/office/word/2018/wordml" xmlns:w16du="http://schemas.microsoft.com/office/word/2023/wordml/word16du" xmlns:w16sdtdh="http://schemas.microsoft.com/office/word/2020/wordml/sdtdatahash" xmlns:w16sdtfl="http://schemas.microsoft.com/office/word/2024/wordml/sdtformatlock" xmlns:w16se="http://schemas.microsoft.com/office/word/2015/wordml/symex" xmlns:wpg="http://schemas.microsoft.com/office/word/2010/wordprocessingGroup" xmlns:wpi="http://schemas.microsoft.com/office/word/2010/wordprocessingInk" xmlns:wne="http://schemas.microsoft.com/office/word/2006/wordml" xmlns:wps="http://schemas.microsoft.com/office/word/2010/wordprocessingShape" mc:Ignorable="w14 w15 w16se w16cid w16 w16cex w16sdtdh w16sdtfl w16du wp14">
+<w:document xmlns:wpc="http://schemas.microsoft.com/office/word/2010/wordprocessingCanvas" xmlns:cx="http://schemas.microsoft.com/office/drawing/2014/chartex" xmlns:cx1="http://schemas.microsoft.com/office/drawing/2015/9/8/chartex" xmlns:cx2="http://schemas.microsoft.com/office/drawing/2015/10/21/chartex" xmlns:cx3="http://schemas.microsoft.com/office/drawing/2016/5/9/chartex" xmlns:cx4="http://schemas.microsoft.com/office/drawing/2016/5/10/chartex" xmlns:cx5="http://schemas.microsoft.com/office/drawing/2016/5/11/chartex" xmlns:cx6="http://schemas.microsoft.com/office/drawing/2016/5/12/chartex" xmlns:cx7="http://schemas.microsoft.com/office/drawing/2016/5/13/chartex" xmlns:cx8="http://schemas.microsoft.com/office/drawing/2016/5/14/chartex" xmlns:mc="http://schemas.openxmlformats.org/markup-compatibility/2006" xmlns:aink="http://schemas.microsoft.com/office/drawing/2016/ink" xmlns:am3d="http://schemas.microsoft.com/office/drawing/2017/model3d" xmlns:o="urn:schemas-microsoft-com:office:office" xmlns:oel="http://schemas.microsoft.com/office/2019/extlst" xmlns:r="http://schemas.openxmlformats.org/officeDocument/2006/relationships" xmlns:m="http://schemas.openxmlformats.org/officeDocument/2006/math" xmlns:v="urn:schemas-microsoft-com:vml" xmlns:wp14="http://schemas.microsoft.com/office/word/2010/wordprocessingDrawing" xmlns:wp="http://schemas.openxmlformats.org/drawingml/2006/wordprocessingDrawing" xmlns:w10="urn:schemas-microsoft-com:office:word" xmlns:w="http://schemas.openxmlformats.org/wordprocessingml/2006/main" xmlns:w14="http://schemas.microsoft.com/office/word/2010/wordml" xmlns:w15="http://schemas.microsoft.com/office/word/2012/wordml" xmlns:w16cex="http://schemas.microsoft.com/office/word/2018/wordml/cex" xmlns:w16cid="http://schemas.microsoft.com/office/word/2016/wordml/cid" xmlns:w16="http://schemas.microsoft.com/office/word/2018/wordml" xmlns:w16du="http://schemas.microsoft.com/office/word/2023/wordml/word16du" xmlns:w16sdtdh="http://schemas.microsoft.com/office/word/2020/wordml/sdtdatahash" xmlns:w16sdtfl="http://schemas.microsoft.com/office/word/2024/wordml/sdtformatlock" xmlns:w16se="http://schemas.microsoft.com/office/word/2015/wordml/symex" xmlns:wpg="http://schemas.microsoft.com/office/word/2010/wordprocessingGroup" xmlns:wpi="http://schemas.microsoft.com/office/word/2010/wordprocessingInk" xmlns:wne="http://schemas.microsoft.com/office/word/2006/wordml" xmlns:wps="http://schemas.microsoft.com/office/word/2010/wordprocessingShape" mc:Ignorable="w14 w15 w16se w16cid w16 w16cex w16sdtdh w16sdtfl w16du wp14">
   <w:background w:color="FFFFFF"/>
   <w:body>
     <w:p>
@@ -473,7 +473,7 @@
     <w:tbl>
       <w:tblPr>
         <w:tblStyle w:val="TableGrid"/>
-        <w:tblW w:w="10089" w:type="dxa"/>
+        <w:tblW w:w="10059" w:type="dxa"/>
         <w:tblInd w:w="-567" w:type="dxa"/>
         <w:tblLayout w:type="fixed"/>
         <w:tblLook w:val="04A0" w:firstRow="1" w:lastRow="0" w:firstColumn="1" w:lastColumn="0" w:noHBand="0" w:noVBand="1"/>
@@ -481,17 +481,12 @@
       <w:tblGrid>
         <w:gridCol w:w="704"/>
         <w:gridCol w:w="3686"/>
-        <w:gridCol w:w="851"/>
-        <w:gridCol w:w="29"/>
-        <w:gridCol w:w="2380"/>
-        <w:gridCol w:w="29"/>
-        <w:gridCol w:w="2381"/>
-        <w:gridCol w:w="29"/>
+        <w:gridCol w:w="850"/>
+        <w:gridCol w:w="2409"/>
+        <w:gridCol w:w="2410"/>
       </w:tblGrid>
       <w:tr>
         <w:trPr>
-          <w:gridAfter w:val="1"/>
-          <w:wAfter w:w="29" w:type="dxa"/>
           <w:trHeight w:val="328"/>
         </w:trPr>
         <w:tc>
@@ -547,7 +542,7 @@
         </w:tc>
         <w:tc>
           <w:tcPr>
-            <w:tcW w:w="851" w:type="dxa"/>
+            <w:tcW w:w="850" w:type="dxa"/>
             <w:shd w:val="clear" w:color="auto" w:fill="EAF1DD" w:themeFill="accent3" w:themeFillTint="33"/>
           </w:tcPr>
           <w:p>
@@ -579,7 +574,6 @@
         <w:tc>
           <w:tcPr>
             <w:tcW w:w="2409" w:type="dxa"/>
-            <w:gridSpan w:val="2"/>
             <w:tcBorders>
               <w:top w:val="single" w:sz="8" w:space="0" w:color="auto"/>
             </w:tcBorders>
@@ -607,7 +601,6 @@
         <w:tc>
           <w:tcPr>
             <w:tcW w:w="2410" w:type="dxa"/>
-            <w:gridSpan w:val="2"/>
             <w:tcBorders>
               <w:top w:val="single" w:sz="8" w:space="0" w:color="auto"/>
             </w:tcBorders>
@@ -634,10 +627,6 @@
         </w:tc>
       </w:tr>
       <w:tr>
-        <w:trPr>
-          <w:gridAfter w:val="1"/>
-          <w:wAfter w:w="29" w:type="dxa"/>
-        </w:trPr>
         <w:tc>
           <w:tcPr>
             <w:tcW w:w="704" w:type="dxa"/>
@@ -677,7 +666,7 @@
         </w:tc>
         <w:tc>
           <w:tcPr>
-            <w:tcW w:w="851" w:type="dxa"/>
+            <w:tcW w:w="850" w:type="dxa"/>
           </w:tcPr>
           <w:p>
             <w:pPr>
@@ -693,7 +682,6 @@
         <w:tc>
           <w:tcPr>
             <w:tcW w:w="2409" w:type="dxa"/>
-            <w:gridSpan w:val="2"/>
           </w:tcPr>
           <w:p>
             <w:pPr>
@@ -709,7 +697,6 @@
         <w:tc>
           <w:tcPr>
             <w:tcW w:w="2410" w:type="dxa"/>
-            <w:gridSpan w:val="2"/>
           </w:tcPr>
           <w:p>
             <w:pPr>
@@ -726,8 +713,8 @@
       <w:tr>
         <w:tc>
           <w:tcPr>
-            <w:tcW w:w="5270" w:type="dxa"/>
-            <w:gridSpan w:val="4"/>
+            <w:tcW w:w="5240" w:type="dxa"/>
+            <w:gridSpan w:val="3"/>
             <w:vMerge w:val="restart"/>
             <w:vAlign w:val="center"/>
           </w:tcPr>
@@ -760,7 +747,6 @@
         <w:tc>
           <w:tcPr>
             <w:tcW w:w="2409" w:type="dxa"/>
-            <w:gridSpan w:val="2"/>
           </w:tcPr>
           <w:p>
             <w:pPr>
@@ -784,7 +770,6 @@
         <w:tc>
           <w:tcPr>
             <w:tcW w:w="2410" w:type="dxa"/>
-            <w:gridSpan w:val="2"/>
             <w:vAlign w:val="center"/>
           </w:tcPr>
           <w:p>
@@ -802,8 +787,8 @@
       <w:tr>
         <w:tc>
           <w:tcPr>
-            <w:tcW w:w="5270" w:type="dxa"/>
-            <w:gridSpan w:val="4"/>
+            <w:tcW w:w="5240" w:type="dxa"/>
+            <w:gridSpan w:val="3"/>
             <w:vMerge/>
           </w:tcPr>
           <w:p>
@@ -817,7 +802,6 @@
         <w:tc>
           <w:tcPr>
             <w:tcW w:w="2409" w:type="dxa"/>
-            <w:gridSpan w:val="2"/>
           </w:tcPr>
           <w:p>
             <w:pPr>
@@ -846,7 +830,6 @@
         <w:tc>
           <w:tcPr>
             <w:tcW w:w="2410" w:type="dxa"/>
-            <w:gridSpan w:val="2"/>
           </w:tcPr>
           <w:p>
             <w:pPr>
@@ -869,8 +852,8 @@
       <w:tr>
         <w:tc>
           <w:tcPr>
-            <w:tcW w:w="5270" w:type="dxa"/>
-            <w:gridSpan w:val="4"/>
+            <w:tcW w:w="5240" w:type="dxa"/>
+            <w:gridSpan w:val="3"/>
             <w:vMerge/>
           </w:tcPr>
           <w:p>
@@ -884,7 +867,6 @@
         <w:tc>
           <w:tcPr>
             <w:tcW w:w="2409" w:type="dxa"/>
-            <w:gridSpan w:val="2"/>
           </w:tcPr>
           <w:p>
             <w:pPr>
@@ -908,7 +890,6 @@
         <w:tc>
           <w:tcPr>
             <w:tcW w:w="2410" w:type="dxa"/>
-            <w:gridSpan w:val="2"/>
           </w:tcPr>
           <w:p>
             <w:pPr>
@@ -925,8 +906,8 @@
       <w:tr>
         <w:tc>
           <w:tcPr>
-            <w:tcW w:w="5270" w:type="dxa"/>
-            <w:gridSpan w:val="4"/>
+            <w:tcW w:w="5240" w:type="dxa"/>
+            <w:gridSpan w:val="3"/>
             <w:vMerge/>
           </w:tcPr>
           <w:p>
@@ -940,7 +921,6 @@
         <w:tc>
           <w:tcPr>
             <w:tcW w:w="2409" w:type="dxa"/>
-            <w:gridSpan w:val="2"/>
           </w:tcPr>
           <w:p>
             <w:pPr>
@@ -964,7 +944,6 @@
         <w:tc>
           <w:tcPr>
             <w:tcW w:w="2410" w:type="dxa"/>
-            <w:gridSpan w:val="2"/>
           </w:tcPr>
           <w:p>
             <w:pPr>
@@ -981,8 +960,8 @@
       <w:tr>
         <w:tc>
           <w:tcPr>
-            <w:tcW w:w="5270" w:type="dxa"/>
-            <w:gridSpan w:val="4"/>
+            <w:tcW w:w="5240" w:type="dxa"/>
+            <w:gridSpan w:val="3"/>
             <w:vMerge/>
           </w:tcPr>
           <w:p>
@@ -996,7 +975,6 @@
         <w:tc>
           <w:tcPr>
             <w:tcW w:w="2409" w:type="dxa"/>
-            <w:gridSpan w:val="2"/>
           </w:tcPr>
           <w:p>
             <w:pPr>
@@ -1020,7 +998,6 @@
         <w:tc>
           <w:tcPr>
             <w:tcW w:w="2410" w:type="dxa"/>
-            <w:gridSpan w:val="2"/>
           </w:tcPr>
           <w:p>
             <w:pPr>
@@ -1040,8 +1017,8 @@
       <w:tr>
         <w:tc>
           <w:tcPr>
-            <w:tcW w:w="5270" w:type="dxa"/>
-            <w:gridSpan w:val="4"/>
+            <w:tcW w:w="5240" w:type="dxa"/>
+            <w:gridSpan w:val="3"/>
             <w:vMerge/>
           </w:tcPr>
           <w:p>
@@ -1055,7 +1032,6 @@
         <w:tc>
           <w:tcPr>
             <w:tcW w:w="2409" w:type="dxa"/>
-            <w:gridSpan w:val="2"/>
           </w:tcPr>
           <w:p>
             <w:pPr>
@@ -1088,7 +1064,6 @@
         <w:tc>
           <w:tcPr>
             <w:tcW w:w="2410" w:type="dxa"/>
-            <w:gridSpan w:val="2"/>
           </w:tcPr>
           <w:p>
             <w:pPr>
@@ -1114,8 +1089,8 @@
       <w:tr>
         <w:tc>
           <w:tcPr>
-            <w:tcW w:w="5270" w:type="dxa"/>
-            <w:gridSpan w:val="4"/>
+            <w:tcW w:w="5240" w:type="dxa"/>
+            <w:gridSpan w:val="3"/>
             <w:vMerge/>
           </w:tcPr>
           <w:p>
@@ -1129,7 +1104,6 @@
         <w:tc>
           <w:tcPr>
             <w:tcW w:w="2409" w:type="dxa"/>
-            <w:gridSpan w:val="2"/>
           </w:tcPr>
           <w:p>
             <w:pPr>
@@ -1154,7 +1128,6 @@
         <w:tc>
           <w:tcPr>
             <w:tcW w:w="2410" w:type="dxa"/>
-            <w:gridSpan w:val="2"/>
           </w:tcPr>
           <w:p>
             <w:pPr>
@@ -1177,8 +1150,8 @@
       <w:tr>
         <w:tc>
           <w:tcPr>
-            <w:tcW w:w="5270" w:type="dxa"/>
-            <w:gridSpan w:val="4"/>
+            <w:tcW w:w="5240" w:type="dxa"/>
+            <w:gridSpan w:val="3"/>
             <w:vMerge/>
           </w:tcPr>
           <w:p>
@@ -1192,7 +1165,6 @@
         <w:tc>
           <w:tcPr>
             <w:tcW w:w="2409" w:type="dxa"/>
-            <w:gridSpan w:val="2"/>
           </w:tcPr>
           <w:p>
             <w:pPr>
@@ -1216,7 +1188,6 @@
         <w:tc>
           <w:tcPr>
             <w:tcW w:w="2410" w:type="dxa"/>
-            <w:gridSpan w:val="2"/>
             <w:vAlign w:val="center"/>
           </w:tcPr>
           <w:p>
@@ -2190,7 +2161,7 @@
 </file>
 
 <file path=word/endnotes.xml><?xml version="1.0" encoding="utf-8"?>
-<w:endnotes xmlns:wpc="http://schemas.microsoft.com/office/word/2010/wordprocessingCanvas" xmlns:cx="http://schemas.microsoft.com/office/drawing/2014/chartex" xmlns:cx1="http://schemas.microsoft.com/office/drawing/2015/9/8/chartex" xmlns:cx2="http://schemas.microsoft.com/office/drawing/2015/10/21/chartex" xmlns:cx3="http://schemas.microsoft.com/office/drawing/2016/5/9/chartex" xmlns:cx4="http://schemas.microsoft.com/office/drawing/2016/5/10/chartex" xmlns:cx5="http://schemas.microsoft.com/office/drawing/2016/5/11/chartex" xmlns:cx6="http://schemas.microsoft.com/office/drawing/2016/5/12/chartex" xmlns:cx7="http://schemas.microsoft.com/office/drawing/2016/5/13/chartex" xmlns:cx8="http://schemas.microsoft.com/office/drawing/2016/5/14/chartex" xmlns:mc="http://schemas.openxmlformats.org/markup-compatibility/2006" xmlns:aink="http://schemas.microsoft.com/office/drawing/2016/ink" xmlns:am3d="http://schemas.microsoft.com/office/drawing/2017/model3d" xmlns:o="urn:schemas-microsoft-com:office:office" xmlns:oel="http://schemas.microsoft.com/office/2019/extlst" xmlns:r="http://schemas.openxmlformats.org/officeDocument/2006/relationships" xmlns:m="http://schemas.openxmlformats.org/officeDocument/2006/math" xmlns:v="urn:schemas-microsoft-com:vml" xmlns:wp14="http://schemas.microsoft.com/office/word/2010/wordprocessingDrawing" xmlns:wp="http://schemas.openxmlformats.org/drawingml/2006/wordprocessingDrawing" xmlns:w10="urn:schemas-microsoft-com:office:word" xmlns:w="http://schemas.openxmlformats.org/wordprocessingml/2006/main" xmlns:w14="http://schemas.microsoft.com/office/word/2010/wordml" xmlns:w15="http://schemas.microsoft.com/office/word/2012/wordml" xmlns:w16cei="http://schemas.microsoft.com/office/word/2026/wordml/cei" xmlns:w16cex="http://schemas.microsoft.com/office/word/2018/wordml/cex" xmlns:w16cid="http://schemas.microsoft.com/office/word/2016/wordml/cid" xmlns:w16="http://schemas.microsoft.com/office/word/2018/wordml" xmlns:w16du="http://schemas.microsoft.com/office/word/2023/wordml/word16du" xmlns:w16sdtdh="http://schemas.microsoft.com/office/word/2020/wordml/sdtdatahash" xmlns:w16sdtfl="http://schemas.microsoft.com/office/word/2024/wordml/sdtformatlock" xmlns:w16se="http://schemas.microsoft.com/office/word/2015/wordml/symex" xmlns:wpg="http://schemas.microsoft.com/office/word/2010/wordprocessingGroup" xmlns:wpi="http://schemas.microsoft.com/office/word/2010/wordprocessingInk" xmlns:wne="http://schemas.microsoft.com/office/word/2006/wordml" xmlns:wps="http://schemas.microsoft.com/office/word/2010/wordprocessingShape" mc:Ignorable="w14 w15 w16se w16cid w16 w16cex w16sdtdh w16sdtfl w16du wp14">
+<w:endnotes xmlns:wpc="http://schemas.microsoft.com/office/word/2010/wordprocessingCanvas" xmlns:cx="http://schemas.microsoft.com/office/drawing/2014/chartex" xmlns:cx1="http://schemas.microsoft.com/office/drawing/2015/9/8/chartex" xmlns:cx2="http://schemas.microsoft.com/office/drawing/2015/10/21/chartex" xmlns:cx3="http://schemas.microsoft.com/office/drawing/2016/5/9/chartex" xmlns:cx4="http://schemas.microsoft.com/office/drawing/2016/5/10/chartex" xmlns:cx5="http://schemas.microsoft.com/office/drawing/2016/5/11/chartex" xmlns:cx6="http://schemas.microsoft.com/office/drawing/2016/5/12/chartex" xmlns:cx7="http://schemas.microsoft.com/office/drawing/2016/5/13/chartex" xmlns:cx8="http://schemas.microsoft.com/office/drawing/2016/5/14/chartex" xmlns:mc="http://schemas.openxmlformats.org/markup-compatibility/2006" xmlns:aink="http://schemas.microsoft.com/office/drawing/2016/ink" xmlns:am3d="http://schemas.microsoft.com/office/drawing/2017/model3d" xmlns:o="urn:schemas-microsoft-com:office:office" xmlns:oel="http://schemas.microsoft.com/office/2019/extlst" xmlns:r="http://schemas.openxmlformats.org/officeDocument/2006/relationships" xmlns:m="http://schemas.openxmlformats.org/officeDocument/2006/math" xmlns:v="urn:schemas-microsoft-com:vml" xmlns:wp14="http://schemas.microsoft.com/office/word/2010/wordprocessingDrawing" xmlns:wp="http://schemas.openxmlformats.org/drawingml/2006/wordprocessingDrawing" xmlns:w10="urn:schemas-microsoft-com:office:word" xmlns:w="http://schemas.openxmlformats.org/wordprocessingml/2006/main" xmlns:w14="http://schemas.microsoft.com/office/word/2010/wordml" xmlns:w15="http://schemas.microsoft.com/office/word/2012/wordml" xmlns:w16cex="http://schemas.microsoft.com/office/word/2018/wordml/cex" xmlns:w16cid="http://schemas.microsoft.com/office/word/2016/wordml/cid" xmlns:w16="http://schemas.microsoft.com/office/word/2018/wordml" xmlns:w16du="http://schemas.microsoft.com/office/word/2023/wordml/word16du" xmlns:w16sdtdh="http://schemas.microsoft.com/office/word/2020/wordml/sdtdatahash" xmlns:w16sdtfl="http://schemas.microsoft.com/office/word/2024/wordml/sdtformatlock" xmlns:w16se="http://schemas.microsoft.com/office/word/2015/wordml/symex" xmlns:wpg="http://schemas.microsoft.com/office/word/2010/wordprocessingGroup" xmlns:wpi="http://schemas.microsoft.com/office/word/2010/wordprocessingInk" xmlns:wne="http://schemas.microsoft.com/office/word/2006/wordml" xmlns:wps="http://schemas.microsoft.com/office/word/2010/wordprocessingShape" mc:Ignorable="w14 w15 w16se w16cid w16 w16cex w16sdtdh w16sdtfl w16du wp14">
   <w:endnote w:type="separator" w:id="-1">
     <w:p>
       <w:pPr>
@@ -2215,7 +2186,7 @@
 </file>
 
 <file path=word/footnotes.xml><?xml version="1.0" encoding="utf-8"?>
-<w:footnotes xmlns:wpc="http://schemas.microsoft.com/office/word/2010/wordprocessingCanvas" xmlns:cx="http://schemas.microsoft.com/office/drawing/2014/chartex" xmlns:cx1="http://schemas.microsoft.com/office/drawing/2015/9/8/chartex" xmlns:cx2="http://schemas.microsoft.com/office/drawing/2015/10/21/chartex" xmlns:cx3="http://schemas.microsoft.com/office/drawing/2016/5/9/chartex" xmlns:cx4="http://schemas.microsoft.com/office/drawing/2016/5/10/chartex" xmlns:cx5="http://schemas.microsoft.com/office/drawing/2016/5/11/chartex" xmlns:cx6="http://schemas.microsoft.com/office/drawing/2016/5/12/chartex" xmlns:cx7="http://schemas.microsoft.com/office/drawing/2016/5/13/chartex" xmlns:cx8="http://schemas.microsoft.com/office/drawing/2016/5/14/chartex" xmlns:mc="http://schemas.openxmlformats.org/markup-compatibility/2006" xmlns:aink="http://schemas.microsoft.com/office/drawing/2016/ink" xmlns:am3d="http://schemas.microsoft.com/office/drawing/2017/model3d" xmlns:o="urn:schemas-microsoft-com:office:office" xmlns:oel="http://schemas.microsoft.com/office/2019/extlst" xmlns:r="http://schemas.openxmlformats.org/officeDocument/2006/relationships" xmlns:m="http://schemas.openxmlformats.org/officeDocument/2006/math" xmlns:v="urn:schemas-microsoft-com:vml" xmlns:wp14="http://schemas.microsoft.com/office/word/2010/wordprocessingDrawing" xmlns:wp="http://schemas.openxmlformats.org/drawingml/2006/wordprocessingDrawing" xmlns:w10="urn:schemas-microsoft-com:office:word" xmlns:w="http://schemas.openxmlformats.org/wordprocessingml/2006/main" xmlns:w14="http://schemas.microsoft.com/office/word/2010/wordml" xmlns:w15="http://schemas.microsoft.com/office/word/2012/wordml" xmlns:w16cei="http://schemas.microsoft.com/office/word/2026/wordml/cei" xmlns:w16cex="http://schemas.microsoft.com/office/word/2018/wordml/cex" xmlns:w16cid="http://schemas.microsoft.com/office/word/2016/wordml/cid" xmlns:w16="http://schemas.microsoft.com/office/word/2018/wordml" xmlns:w16du="http://schemas.microsoft.com/office/word/2023/wordml/word16du" xmlns:w16sdtdh="http://schemas.microsoft.com/office/word/2020/wordml/sdtdatahash" xmlns:w16sdtfl="http://schemas.microsoft.com/office/word/2024/wordml/sdtformatlock" xmlns:w16se="http://schemas.microsoft.com/office/word/2015/wordml/symex" xmlns:wpg="http://schemas.microsoft.com/office/word/2010/wordprocessingGroup" xmlns:wpi="http://schemas.microsoft.com/office/word/2010/wordprocessingInk" xmlns:wne="http://schemas.microsoft.com/office/word/2006/wordml" xmlns:wps="http://schemas.microsoft.com/office/word/2010/wordprocessingShape" mc:Ignorable="w14 w15 w16se w16cid w16 w16cex w16sdtdh w16sdtfl w16du wp14">
+<w:footnotes xmlns:wpc="http://schemas.microsoft.com/office/word/2010/wordprocessingCanvas" xmlns:cx="http://schemas.microsoft.com/office/drawing/2014/chartex" xmlns:cx1="http://schemas.microsoft.com/office/drawing/2015/9/8/chartex" xmlns:cx2="http://schemas.microsoft.com/office/drawing/2015/10/21/chartex" xmlns:cx3="http://schemas.microsoft.com/office/drawing/2016/5/9/chartex" xmlns:cx4="http://schemas.microsoft.com/office/drawing/2016/5/10/chartex" xmlns:cx5="http://schemas.microsoft.com/office/drawing/2016/5/11/chartex" xmlns:cx6="http://schemas.microsoft.com/office/drawing/2016/5/12/chartex" xmlns:cx7="http://schemas.microsoft.com/office/drawing/2016/5/13/chartex" xmlns:cx8="http://schemas.microsoft.com/office/drawing/2016/5/14/chartex" xmlns:mc="http://schemas.openxmlformats.org/markup-compatibility/2006" xmlns:aink="http://schemas.microsoft.com/office/drawing/2016/ink" xmlns:am3d="http://schemas.microsoft.com/office/drawing/2017/model3d" xmlns:o="urn:schemas-microsoft-com:office:office" xmlns:oel="http://schemas.microsoft.com/office/2019/extlst" xmlns:r="http://schemas.openxmlformats.org/officeDocument/2006/relationships" xmlns:m="http://schemas.openxmlformats.org/officeDocument/2006/math" xmlns:v="urn:schemas-microsoft-com:vml" xmlns:wp14="http://schemas.microsoft.com/office/word/2010/wordprocessingDrawing" xmlns:wp="http://schemas.openxmlformats.org/drawingml/2006/wordprocessingDrawing" xmlns:w10="urn:schemas-microsoft-com:office:word" xmlns:w="http://schemas.openxmlformats.org/wordprocessingml/2006/main" xmlns:w14="http://schemas.microsoft.com/office/word/2010/wordml" xmlns:w15="http://schemas.microsoft.com/office/word/2012/wordml" xmlns:w16cex="http://schemas.microsoft.com/office/word/2018/wordml/cex" xmlns:w16cid="http://schemas.microsoft.com/office/word/2016/wordml/cid" xmlns:w16="http://schemas.microsoft.com/office/word/2018/wordml" xmlns:w16du="http://schemas.microsoft.com/office/word/2023/wordml/word16du" xmlns:w16sdtdh="http://schemas.microsoft.com/office/word/2020/wordml/sdtdatahash" xmlns:w16sdtfl="http://schemas.microsoft.com/office/word/2024/wordml/sdtformatlock" xmlns:w16se="http://schemas.microsoft.com/office/word/2015/wordml/symex" xmlns:wpg="http://schemas.microsoft.com/office/word/2010/wordprocessingGroup" xmlns:wpi="http://schemas.microsoft.com/office/word/2010/wordprocessingInk" xmlns:wne="http://schemas.microsoft.com/office/word/2006/wordml" xmlns:wps="http://schemas.microsoft.com/office/word/2010/wordprocessingShape" mc:Ignorable="w14 w15 w16se w16cid w16 w16cex w16sdtdh w16sdtfl w16du wp14">
   <w:footnote w:type="separator" w:id="-1">
     <w:p>
       <w:pPr>
@@ -2240,7 +2211,7 @@
 </file>
 
 <file path=word/header1.xml><?xml version="1.0" encoding="utf-8"?>
-<w:hdr xmlns:wpc="http://schemas.microsoft.com/office/word/2010/wordprocessingCanvas" xmlns:cx="http://schemas.microsoft.com/office/drawing/2014/chartex" xmlns:cx1="http://schemas.microsoft.com/office/drawing/2015/9/8/chartex" xmlns:cx2="http://schemas.microsoft.com/office/drawing/2015/10/21/chartex" xmlns:cx3="http://schemas.microsoft.com/office/drawing/2016/5/9/chartex" xmlns:cx4="http://schemas.microsoft.com/office/drawing/2016/5/10/chartex" xmlns:cx5="http://schemas.microsoft.com/office/drawing/2016/5/11/chartex" xmlns:cx6="http://schemas.microsoft.com/office/drawing/2016/5/12/chartex" xmlns:cx7="http://schemas.microsoft.com/office/drawing/2016/5/13/chartex" xmlns:cx8="http://schemas.microsoft.com/office/drawing/2016/5/14/chartex" xmlns:mc="http://schemas.openxmlformats.org/markup-compatibility/2006" xmlns:aink="http://schemas.microsoft.com/office/drawing/2016/ink" xmlns:am3d="http://schemas.microsoft.com/office/drawing/2017/model3d" xmlns:o="urn:schemas-microsoft-com:office:office" xmlns:oel="http://schemas.microsoft.com/office/2019/extlst" xmlns:r="http://schemas.openxmlformats.org/officeDocument/2006/relationships" xmlns:m="http://schemas.openxmlformats.org/officeDocument/2006/math" xmlns:v="urn:schemas-microsoft-com:vml" xmlns:wp14="http://schemas.microsoft.com/office/word/2010/wordprocessingDrawing" xmlns:wp="http://schemas.openxmlformats.org/drawingml/2006/wordprocessingDrawing" xmlns:w10="urn:schemas-microsoft-com:office:word" xmlns:w="http://schemas.openxmlformats.org/wordprocessingml/2006/main" xmlns:w14="http://schemas.microsoft.com/office/word/2010/wordml" xmlns:w15="http://schemas.microsoft.com/office/word/2012/wordml" xmlns:w16cei="http://schemas.microsoft.com/office/word/2026/wordml/cei" xmlns:w16cex="http://schemas.microsoft.com/office/word/2018/wordml/cex" xmlns:w16cid="http://schemas.microsoft.com/office/word/2016/wordml/cid" xmlns:w16="http://schemas.microsoft.com/office/word/2018/wordml" xmlns:w16du="http://schemas.microsoft.com/office/word/2023/wordml/word16du" xmlns:w16sdtdh="http://schemas.microsoft.com/office/word/2020/wordml/sdtdatahash" xmlns:w16sdtfl="http://schemas.microsoft.com/office/word/2024/wordml/sdtformatlock" xmlns:w16se="http://schemas.microsoft.com/office/word/2015/wordml/symex" xmlns:wpg="http://schemas.microsoft.com/office/word/2010/wordprocessingGroup" xmlns:wpi="http://schemas.microsoft.com/office/word/2010/wordprocessingInk" xmlns:wne="http://schemas.microsoft.com/office/word/2006/wordml" xmlns:wps="http://schemas.microsoft.com/office/word/2010/wordprocessingShape" mc:Ignorable="w14 w15 w16se w16cid w16 w16cex w16sdtdh w16sdtfl w16du wp14">
+<w:hdr xmlns:wpc="http://schemas.microsoft.com/office/word/2010/wordprocessingCanvas" xmlns:cx="http://schemas.microsoft.com/office/drawing/2014/chartex" xmlns:cx1="http://schemas.microsoft.com/office/drawing/2015/9/8/chartex" xmlns:cx2="http://schemas.microsoft.com/office/drawing/2015/10/21/chartex" xmlns:cx3="http://schemas.microsoft.com/office/drawing/2016/5/9/chartex" xmlns:cx4="http://schemas.microsoft.com/office/drawing/2016/5/10/chartex" xmlns:cx5="http://schemas.microsoft.com/office/drawing/2016/5/11/chartex" xmlns:cx6="http://schemas.microsoft.com/office/drawing/2016/5/12/chartex" xmlns:cx7="http://schemas.microsoft.com/office/drawing/2016/5/13/chartex" xmlns:cx8="http://schemas.microsoft.com/office/drawing/2016/5/14/chartex" xmlns:mc="http://schemas.openxmlformats.org/markup-compatibility/2006" xmlns:aink="http://schemas.microsoft.com/office/drawing/2016/ink" xmlns:am3d="http://schemas.microsoft.com/office/drawing/2017/model3d" xmlns:o="urn:schemas-microsoft-com:office:office" xmlns:oel="http://schemas.microsoft.com/office/2019/extlst" xmlns:r="http://schemas.openxmlformats.org/officeDocument/2006/relationships" xmlns:m="http://schemas.openxmlformats.org/officeDocument/2006/math" xmlns:v="urn:schemas-microsoft-com:vml" xmlns:wp14="http://schemas.microsoft.com/office/word/2010/wordprocessingDrawing" xmlns:wp="http://schemas.openxmlformats.org/drawingml/2006/wordprocessingDrawing" xmlns:w10="urn:schemas-microsoft-com:office:word" xmlns:w="http://schemas.openxmlformats.org/wordprocessingml/2006/main" xmlns:w14="http://schemas.microsoft.com/office/word/2010/wordml" xmlns:w15="http://schemas.microsoft.com/office/word/2012/wordml" xmlns:w16cex="http://schemas.microsoft.com/office/word/2018/wordml/cex" xmlns:w16cid="http://schemas.microsoft.com/office/word/2016/wordml/cid" xmlns:w16="http://schemas.microsoft.com/office/word/2018/wordml" xmlns:w16du="http://schemas.microsoft.com/office/word/2023/wordml/word16du" xmlns:w16sdtdh="http://schemas.microsoft.com/office/word/2020/wordml/sdtdatahash" xmlns:w16sdtfl="http://schemas.microsoft.com/office/word/2024/wordml/sdtformatlock" xmlns:w16se="http://schemas.microsoft.com/office/word/2015/wordml/symex" xmlns:wpg="http://schemas.microsoft.com/office/word/2010/wordprocessingGroup" xmlns:wpi="http://schemas.microsoft.com/office/word/2010/wordprocessingInk" xmlns:wne="http://schemas.microsoft.com/office/word/2006/wordml" xmlns:wps="http://schemas.microsoft.com/office/word/2010/wordprocessingShape" mc:Ignorable="w14 w15 w16se w16cid w16 w16cex w16sdtdh w16sdtfl w16du wp14">
   <w:p>
     <w:pPr>
       <w:pStyle w:val="Header"/>
@@ -2614,7 +2585,7 @@
 </file>
 
 <file path=word/header2.xml><?xml version="1.0" encoding="utf-8"?>
-<w:hdr xmlns:wpc="http://schemas.microsoft.com/office/word/2010/wordprocessingCanvas" xmlns:cx="http://schemas.microsoft.com/office/drawing/2014/chartex" xmlns:cx1="http://schemas.microsoft.com/office/drawing/2015/9/8/chartex" xmlns:cx2="http://schemas.microsoft.com/office/drawing/2015/10/21/chartex" xmlns:cx3="http://schemas.microsoft.com/office/drawing/2016/5/9/chartex" xmlns:cx4="http://schemas.microsoft.com/office/drawing/2016/5/10/chartex" xmlns:cx5="http://schemas.microsoft.com/office/drawing/2016/5/11/chartex" xmlns:cx6="http://schemas.microsoft.com/office/drawing/2016/5/12/chartex" xmlns:cx7="http://schemas.microsoft.com/office/drawing/2016/5/13/chartex" xmlns:cx8="http://schemas.microsoft.com/office/drawing/2016/5/14/chartex" xmlns:mc="http://schemas.openxmlformats.org/markup-compatibility/2006" xmlns:aink="http://schemas.microsoft.com/office/drawing/2016/ink" xmlns:am3d="http://schemas.microsoft.com/office/drawing/2017/model3d" xmlns:o="urn:schemas-microsoft-com:office:office" xmlns:oel="http://schemas.microsoft.com/office/2019/extlst" xmlns:r="http://schemas.openxmlformats.org/officeDocument/2006/relationships" xmlns:m="http://schemas.openxmlformats.org/officeDocument/2006/math" xmlns:v="urn:schemas-microsoft-com:vml" xmlns:wp14="http://schemas.microsoft.com/office/word/2010/wordprocessingDrawing" xmlns:wp="http://schemas.openxmlformats.org/drawingml/2006/wordprocessingDrawing" xmlns:w10="urn:schemas-microsoft-com:office:word" xmlns:w="http://schemas.openxmlformats.org/wordprocessingml/2006/main" xmlns:w14="http://schemas.microsoft.com/office/word/2010/wordml" xmlns:w15="http://schemas.microsoft.com/office/word/2012/wordml" xmlns:w16cei="http://schemas.microsoft.com/office/word/2026/wordml/cei" xmlns:w16cex="http://schemas.microsoft.com/office/word/2018/wordml/cex" xmlns:w16cid="http://schemas.microsoft.com/office/word/2016/wordml/cid" xmlns:w16="http://schemas.microsoft.com/office/word/2018/wordml" xmlns:w16du="http://schemas.microsoft.com/office/word/2023/wordml/word16du" xmlns:w16sdtdh="http://schemas.microsoft.com/office/word/2020/wordml/sdtdatahash" xmlns:w16sdtfl="http://schemas.microsoft.com/office/word/2024/wordml/sdtformatlock" xmlns:w16se="http://schemas.microsoft.com/office/word/2015/wordml/symex" xmlns:wpg="http://schemas.microsoft.com/office/word/2010/wordprocessingGroup" xmlns:wpi="http://schemas.microsoft.com/office/word/2010/wordprocessingInk" xmlns:wne="http://schemas.microsoft.com/office/word/2006/wordml" xmlns:wps="http://schemas.microsoft.com/office/word/2010/wordprocessingShape" mc:Ignorable="w14 w15 w16se w16cid w16 w16cex w16sdtdh w16sdtfl w16du wp14">
+<w:hdr xmlns:wpc="http://schemas.microsoft.com/office/word/2010/wordprocessingCanvas" xmlns:cx="http://schemas.microsoft.com/office/drawing/2014/chartex" xmlns:cx1="http://schemas.microsoft.com/office/drawing/2015/9/8/chartex" xmlns:cx2="http://schemas.microsoft.com/office/drawing/2015/10/21/chartex" xmlns:cx3="http://schemas.microsoft.com/office/drawing/2016/5/9/chartex" xmlns:cx4="http://schemas.microsoft.com/office/drawing/2016/5/10/chartex" xmlns:cx5="http://schemas.microsoft.com/office/drawing/2016/5/11/chartex" xmlns:cx6="http://schemas.microsoft.com/office/drawing/2016/5/12/chartex" xmlns:cx7="http://schemas.microsoft.com/office/drawing/2016/5/13/chartex" xmlns:cx8="http://schemas.microsoft.com/office/drawing/2016/5/14/chartex" xmlns:mc="http://schemas.openxmlformats.org/markup-compatibility/2006" xmlns:aink="http://schemas.microsoft.com/office/drawing/2016/ink" xmlns:am3d="http://schemas.microsoft.com/office/drawing/2017/model3d" xmlns:o="urn:schemas-microsoft-com:office:office" xmlns:oel="http://schemas.microsoft.com/office/2019/extlst" xmlns:r="http://schemas.openxmlformats.org/officeDocument/2006/relationships" xmlns:m="http://schemas.openxmlformats.org/officeDocument/2006/math" xmlns:v="urn:schemas-microsoft-com:vml" xmlns:wp14="http://schemas.microsoft.com/office/word/2010/wordprocessingDrawing" xmlns:wp="http://schemas.openxmlformats.org/drawingml/2006/wordprocessingDrawing" xmlns:w10="urn:schemas-microsoft-com:office:word" xmlns:w="http://schemas.openxmlformats.org/wordprocessingml/2006/main" xmlns:w14="http://schemas.microsoft.com/office/word/2010/wordml" xmlns:w15="http://schemas.microsoft.com/office/word/2012/wordml" xmlns:w16cex="http://schemas.microsoft.com/office/word/2018/wordml/cex" xmlns:w16cid="http://schemas.microsoft.com/office/word/2016/wordml/cid" xmlns:w16="http://schemas.microsoft.com/office/word/2018/wordml" xmlns:w16du="http://schemas.microsoft.com/office/word/2023/wordml/word16du" xmlns:w16sdtdh="http://schemas.microsoft.com/office/word/2020/wordml/sdtdatahash" xmlns:w16sdtfl="http://schemas.microsoft.com/office/word/2024/wordml/sdtformatlock" xmlns:w16se="http://schemas.microsoft.com/office/word/2015/wordml/symex" xmlns:wpg="http://schemas.microsoft.com/office/word/2010/wordprocessingGroup" xmlns:wpi="http://schemas.microsoft.com/office/word/2010/wordprocessingInk" xmlns:wne="http://schemas.microsoft.com/office/word/2006/wordml" xmlns:wps="http://schemas.microsoft.com/office/word/2010/wordprocessingShape" mc:Ignorable="w14 w15 w16se w16cid w16 w16cex w16sdtdh w16sdtfl w16du wp14">
   <w:p>
     <w:r>
       <w:pict w14:anchorId="0DBBE080">
@@ -2648,7 +2619,7 @@
 </file>
 
 <file path=word/numbering.xml><?xml version="1.0" encoding="utf-8"?>
-<w:numbering xmlns:wpc="http://schemas.microsoft.com/office/word/2010/wordprocessingCanvas" xmlns:cx="http://schemas.microsoft.com/office/drawing/2014/chartex" xmlns:cx1="http://schemas.microsoft.com/office/drawing/2015/9/8/chartex" xmlns:cx2="http://schemas.microsoft.com/office/drawing/2015/10/21/chartex" xmlns:cx3="http://schemas.microsoft.com/office/drawing/2016/5/9/chartex" xmlns:cx4="http://schemas.microsoft.com/office/drawing/2016/5/10/chartex" xmlns:cx5="http://schemas.microsoft.com/office/drawing/2016/5/11/chartex" xmlns:cx6="http://schemas.microsoft.com/office/drawing/2016/5/12/chartex" xmlns:cx7="http://schemas.microsoft.com/office/drawing/2016/5/13/chartex" xmlns:cx8="http://schemas.microsoft.com/office/drawing/2016/5/14/chartex" xmlns:mc="http://schemas.openxmlformats.org/markup-compatibility/2006" xmlns:aink="http://schemas.microsoft.com/office/drawing/2016/ink" xmlns:am3d="http://schemas.microsoft.com/office/drawing/2017/model3d" xmlns:o="urn:schemas-microsoft-com:office:office" xmlns:oel="http://schemas.microsoft.com/office/2019/extlst" xmlns:r="http://schemas.openxmlformats.org/officeDocument/2006/relationships" xmlns:m="http://schemas.openxmlformats.org/officeDocument/2006/math" xmlns:v="urn:schemas-microsoft-com:vml" xmlns:wp14="http://schemas.microsoft.com/office/word/2010/wordprocessingDrawing" xmlns:wp="http://schemas.openxmlformats.org/drawingml/2006/wordprocessingDrawing" xmlns:w10="urn:schemas-microsoft-com:office:word" xmlns:w="http://schemas.openxmlformats.org/wordprocessingml/2006/main" xmlns:w14="http://schemas.microsoft.com/office/word/2010/wordml" xmlns:w15="http://schemas.microsoft.com/office/word/2012/wordml" xmlns:w16cei="http://schemas.microsoft.com/office/word/2026/wordml/cei" xmlns:w16cex="http://schemas.microsoft.com/office/word/2018/wordml/cex" xmlns:w16cid="http://schemas.microsoft.com/office/word/2016/wordml/cid" xmlns:w16="http://schemas.microsoft.com/office/word/2018/wordml" xmlns:w16du="http://schemas.microsoft.com/office/word/2023/wordml/word16du" xmlns:w16sdtdh="http://schemas.microsoft.com/office/word/2020/wordml/sdtdatahash" xmlns:w16sdtfl="http://schemas.microsoft.com/office/word/2024/wordml/sdtformatlock" xmlns:w16se="http://schemas.microsoft.com/office/word/2015/wordml/symex" xmlns:wpg="http://schemas.microsoft.com/office/word/2010/wordprocessingGroup" xmlns:wpi="http://schemas.microsoft.com/office/word/2010/wordprocessingInk" xmlns:wne="http://schemas.microsoft.com/office/word/2006/wordml" xmlns:wps="http://schemas.microsoft.com/office/word/2010/wordprocessingShape" mc:Ignorable="w14 w15 w16se w16cid w16 w16cex w16sdtdh w16sdtfl w16du wp14">
+<w:numbering xmlns:wpc="http://schemas.microsoft.com/office/word/2010/wordprocessingCanvas" xmlns:cx="http://schemas.microsoft.com/office/drawing/2014/chartex" xmlns:cx1="http://schemas.microsoft.com/office/drawing/2015/9/8/chartex" xmlns:cx2="http://schemas.microsoft.com/office/drawing/2015/10/21/chartex" xmlns:cx3="http://schemas.microsoft.com/office/drawing/2016/5/9/chartex" xmlns:cx4="http://schemas.microsoft.com/office/drawing/2016/5/10/chartex" xmlns:cx5="http://schemas.microsoft.com/office/drawing/2016/5/11/chartex" xmlns:cx6="http://schemas.microsoft.com/office/drawing/2016/5/12/chartex" xmlns:cx7="http://schemas.microsoft.com/office/drawing/2016/5/13/chartex" xmlns:cx8="http://schemas.microsoft.com/office/drawing/2016/5/14/chartex" xmlns:mc="http://schemas.openxmlformats.org/markup-compatibility/2006" xmlns:aink="http://schemas.microsoft.com/office/drawing/2016/ink" xmlns:am3d="http://schemas.microsoft.com/office/drawing/2017/model3d" xmlns:o="urn:schemas-microsoft-com:office:office" xmlns:oel="http://schemas.microsoft.com/office/2019/extlst" xmlns:r="http://schemas.openxmlformats.org/officeDocument/2006/relationships" xmlns:m="http://schemas.openxmlformats.org/officeDocument/2006/math" xmlns:v="urn:schemas-microsoft-com:vml" xmlns:wp14="http://schemas.microsoft.com/office/word/2010/wordprocessingDrawing" xmlns:wp="http://schemas.openxmlformats.org/drawingml/2006/wordprocessingDrawing" xmlns:w10="urn:schemas-microsoft-com:office:word" xmlns:w="http://schemas.openxmlformats.org/wordprocessingml/2006/main" xmlns:w14="http://schemas.microsoft.com/office/word/2010/wordml" xmlns:w15="http://schemas.microsoft.com/office/word/2012/wordml" xmlns:w16cex="http://schemas.microsoft.com/office/word/2018/wordml/cex" xmlns:w16cid="http://schemas.microsoft.com/office/word/2016/wordml/cid" xmlns:w16="http://schemas.microsoft.com/office/word/2018/wordml" xmlns:w16du="http://schemas.microsoft.com/office/word/2023/wordml/word16du" xmlns:w16sdtdh="http://schemas.microsoft.com/office/word/2020/wordml/sdtdatahash" xmlns:w16sdtfl="http://schemas.microsoft.com/office/word/2024/wordml/sdtformatlock" xmlns:w16se="http://schemas.microsoft.com/office/word/2015/wordml/symex" xmlns:wpg="http://schemas.microsoft.com/office/word/2010/wordprocessingGroup" xmlns:wpi="http://schemas.microsoft.com/office/word/2010/wordprocessingInk" xmlns:wne="http://schemas.microsoft.com/office/word/2006/wordml" xmlns:wps="http://schemas.microsoft.com/office/word/2010/wordprocessingShape" mc:Ignorable="w14 w15 w16se w16cid w16 w16cex w16sdtdh w16sdtfl w16du wp14">
   <w:abstractNum w:abstractNumId="0" w15:restartNumberingAfterBreak="0">
     <w:nsid w:val="0DD43B8D"/>
     <w:multiLevelType w:val="hybridMultilevel"/>

</xml_diff>